<commit_message>
Getting towards end of W1
</commit_message>
<xml_diff>
--- a/Workshops/sbs_template.docx
+++ b/Workshops/sbs_template.docx
@@ -29,7 +29,7 @@
         <w:pStyle w:val="Date"/>
       </w:pPr>
       <w:r>
-        <w:t xml:space="preserve">2024-08-12</w:t>
+        <w:t xml:space="preserve">2024-08-13</w:t>
       </w:r>
     </w:p>
     <w:sdt>
@@ -51,7 +51,7 @@
         <w:p>
           <w:r>
             <w:fldChar w:fldCharType="begin" w:dirty="true"/>
-            <w:instrText xml:space="preserve">TOC \o "1-2" \h \z \u</w:instrText>
+            <w:instrText xml:space="preserve">TOC \o "1-3" \h \z \u</w:instrText>
             <w:fldChar w:fldCharType="separate"/>
             <w:fldChar w:fldCharType="end"/>
           </w:r>
@@ -121,7 +121,7 @@
     <w:bookmarkEnd w:id="20"/>
     <w:bookmarkEnd w:id="21"/>
     <w:bookmarkEnd w:id="22"/>
-    <w:bookmarkStart w:id="28" w:name="oiajhs"/>
+    <w:bookmarkStart w:id="24" w:name="oiajhs"/>
     <w:p>
       <w:pPr>
         <w:pStyle w:val="Heading1"/>
@@ -157,8 +157,19 @@
         </w:r>
       </w:hyperlink>
       <w:r>
-        <w:t xml:space="preserve">.</w:t>
-      </w:r>
+        <w:t xml:space="preserve">. or</w:t>
+      </w:r>
+      <w:r>
+        <w:t xml:space="preserve"> </w:t>
+      </w:r>
+      <w:hyperlink r:id="rId23">
+        <w:r>
+          <w:rPr>
+            <w:rStyle w:val="Hyperlink"/>
+          </w:rPr>
+          <w:t xml:space="preserve">here</w:t>
+        </w:r>
+      </w:hyperlink>
     </w:p>
     <w:p>
       <w:pPr>
@@ -184,6 +195,115 @@
         <w:t xml:space="preserve">button a document will be generated that includes both content as well as the output of any embedded R code chunks within the document. You can embed an R code chunk like this:</w:t>
       </w:r>
     </w:p>
+    <w:bookmarkEnd w:id="24"/>
+    <w:bookmarkStart w:id="29" w:name="lists"/>
+    <w:p>
+      <w:pPr>
+        <w:pStyle w:val="Heading1"/>
+      </w:pPr>
+      <w:r>
+        <w:t xml:space="preserve">Lists</w:t>
+      </w:r>
+    </w:p>
+    <w:p>
+      <w:pPr>
+        <w:numPr>
+          <w:ilvl w:val="0"/>
+          <w:numId w:val="1001"/>
+        </w:numPr>
+      </w:pPr>
+      <w:r>
+        <w:t xml:space="preserve">abs</w:t>
+      </w:r>
+    </w:p>
+    <w:p>
+      <w:pPr>
+        <w:numPr>
+          <w:ilvl w:val="0"/>
+          <w:numId w:val="1001"/>
+        </w:numPr>
+      </w:pPr>
+      <w:r>
+        <w:t xml:space="preserve">asodiasd</w:t>
+      </w:r>
+    </w:p>
+    <w:p>
+      <w:pPr>
+        <w:numPr>
+          <w:ilvl w:val="0"/>
+          <w:numId w:val="1001"/>
+        </w:numPr>
+      </w:pPr>
+      <w:r>
+        <w:t xml:space="preserve">askdm</w:t>
+      </w:r>
+    </w:p>
+    <w:p>
+      <w:pPr>
+        <w:numPr>
+          <w:ilvl w:val="0"/>
+          <w:numId w:val="1001"/>
+        </w:numPr>
+      </w:pPr>
+      <w:r>
+        <w:t xml:space="preserve">aspidj</w:t>
+      </w:r>
+    </w:p>
+    <w:p>
+      <w:pPr>
+        <w:numPr>
+          <w:ilvl w:val="0"/>
+          <w:numId w:val="1001"/>
+        </w:numPr>
+      </w:pPr>
+      <w:r>
+        <w:t xml:space="preserve">paksdsa</w:t>
+      </w:r>
+    </w:p>
+    <w:p>
+      <w:pPr>
+        <w:numPr>
+          <w:ilvl w:val="0"/>
+          <w:numId w:val="1001"/>
+        </w:numPr>
+      </w:pPr>
+      <w:r>
+        <w:t xml:space="preserve">aksmdsakd</w:t>
+      </w:r>
+    </w:p>
+    <w:p>
+      <w:pPr>
+        <w:numPr>
+          <w:ilvl w:val="0"/>
+          <w:numId w:val="1002"/>
+        </w:numPr>
+      </w:pPr>
+      <w:r>
+        <w:t xml:space="preserve">apskdmsa</w:t>
+      </w:r>
+    </w:p>
+    <w:p>
+      <w:pPr>
+        <w:numPr>
+          <w:ilvl w:val="0"/>
+          <w:numId w:val="1002"/>
+        </w:numPr>
+      </w:pPr>
+      <w:r>
+        <w:t xml:space="preserve">lkaspljmdkopas</w:t>
+      </w:r>
+    </w:p>
+    <w:p>
+      <w:pPr>
+        <w:numPr>
+          <w:ilvl w:val="0"/>
+          <w:numId w:val="1002"/>
+        </w:numPr>
+      </w:pPr>
+      <w:r>
+        <w:t xml:space="preserve">paosdsad</w:t>
+      </w:r>
+    </w:p>
     <w:p>
       <w:pPr>
         <w:pStyle w:val="SourceCode"/>
@@ -266,7 +386,7 @@
         <w:t xml:space="preserve">##  Max.   :25.0   Max.   :120.00</w:t>
       </w:r>
     </w:p>
-    <w:bookmarkStart w:id="27" w:name="including-plots"/>
+    <w:bookmarkStart w:id="28" w:name="including-plots"/>
     <w:p>
       <w:pPr>
         <w:pStyle w:val="Heading2"/>
@@ -292,18 +412,18 @@
           <wp:inline>
             <wp:extent cx="4620126" cy="3696101"/>
             <wp:effectExtent b="0" l="0" r="0" t="0"/>
-            <wp:docPr descr="" title="" id="25" name="Picture"/>
+            <wp:docPr descr="" title="" id="26" name="Picture"/>
             <a:graphic>
               <a:graphicData uri="http://schemas.openxmlformats.org/drawingml/2006/picture">
                 <pic:pic>
                   <pic:nvPicPr>
-                    <pic:cNvPr descr="sbs_template_files/figure-docx/pressure-1.png" id="26" name="Picture"/>
+                    <pic:cNvPr descr="sbs_template_files/figure-docx/pressure-1.png" id="27" name="Picture"/>
                     <pic:cNvPicPr>
                       <a:picLocks noChangeArrowheads="1" noChangeAspect="1"/>
                     </pic:cNvPicPr>
                   </pic:nvPicPr>
                   <pic:blipFill>
-                    <a:blip r:embed="rId24"/>
+                    <a:blip r:embed="rId25"/>
                     <a:stretch>
                       <a:fillRect/>
                     </a:stretch>
@@ -353,8 +473,217 @@
         <w:t xml:space="preserve">parameter was added to the code chunk to prevent printing of the R code that generated the plot.</w:t>
       </w:r>
     </w:p>
-    <w:bookmarkEnd w:id="27"/>
+    <w:p>
+      <w:pPr>
+        <w:pStyle w:val="SourceCode"/>
+      </w:pPr>
+      <w:r>
+        <w:rPr>
+          <w:rStyle w:val="CommentTok"/>
+        </w:rPr>
+        <w:t xml:space="preserve"># Comments are not read as code.</w:t>
+      </w:r>
+      <w:r>
+        <w:br/>
+      </w:r>
+      <w:r>
+        <w:rPr>
+          <w:rStyle w:val="CommentTok"/>
+        </w:rPr>
+        <w:t xml:space="preserve"># They are notes for ourselves and others.</w:t>
+      </w:r>
+      <w:r>
+        <w:br/>
+      </w:r>
+      <w:r>
+        <w:rPr>
+          <w:rStyle w:val="NormalTok"/>
+        </w:rPr>
+        <w:t xml:space="preserve">my_result </w:t>
+      </w:r>
+      <w:r>
+        <w:rPr>
+          <w:rStyle w:val="OtherTok"/>
+        </w:rPr>
+        <w:t xml:space="preserve">&lt;-</w:t>
+      </w:r>
+      <w:r>
+        <w:rPr>
+          <w:rStyle w:val="NormalTok"/>
+        </w:rPr>
+        <w:t xml:space="preserve"> </w:t>
+      </w:r>
+      <w:r>
+        <w:rPr>
+          <w:rStyle w:val="FunctionTok"/>
+        </w:rPr>
+        <w:t xml:space="preserve">a_function</w:t>
+      </w:r>
+      <w:r>
+        <w:rPr>
+          <w:rStyle w:val="NormalTok"/>
+        </w:rPr>
+        <w:t xml:space="preserve">(</w:t>
+      </w:r>
+      <w:r>
+        <w:rPr>
+          <w:rStyle w:val="AttributeTok"/>
+        </w:rPr>
+        <w:t xml:space="preserve">argument1 =</w:t>
+      </w:r>
+      <w:r>
+        <w:rPr>
+          <w:rStyle w:val="NormalTok"/>
+        </w:rPr>
+        <w:t xml:space="preserve"> </w:t>
+      </w:r>
+      <w:r>
+        <w:rPr>
+          <w:rStyle w:val="StringTok"/>
+        </w:rPr>
+        <w:t xml:space="preserve">"character1"</w:t>
+      </w:r>
+      <w:r>
+        <w:rPr>
+          <w:rStyle w:val="NormalTok"/>
+        </w:rPr>
+        <w:t xml:space="preserve">, </w:t>
+      </w:r>
+      <w:r>
+        <w:br/>
+      </w:r>
+      <w:r>
+        <w:rPr>
+          <w:rStyle w:val="NormalTok"/>
+        </w:rPr>
+        <w:t xml:space="preserve">                        </w:t>
+      </w:r>
+      <w:r>
+        <w:rPr>
+          <w:rStyle w:val="AttributeTok"/>
+        </w:rPr>
+        <w:t xml:space="preserve">argument2 =</w:t>
+      </w:r>
+      <w:r>
+        <w:rPr>
+          <w:rStyle w:val="NormalTok"/>
+        </w:rPr>
+        <w:t xml:space="preserve"> variableA,</w:t>
+      </w:r>
+      <w:r>
+        <w:br/>
+      </w:r>
+      <w:r>
+        <w:rPr>
+          <w:rStyle w:val="NormalTok"/>
+        </w:rPr>
+        <w:t xml:space="preserve">                        </w:t>
+      </w:r>
+      <w:r>
+        <w:rPr>
+          <w:rStyle w:val="AttributeTok"/>
+        </w:rPr>
+        <w:t xml:space="preserve">argument3 =</w:t>
+      </w:r>
+      <w:r>
+        <w:rPr>
+          <w:rStyle w:val="NormalTok"/>
+        </w:rPr>
+        <w:t xml:space="preserve"> </w:t>
+      </w:r>
+      <w:r>
+        <w:rPr>
+          <w:rStyle w:val="DecValTok"/>
+        </w:rPr>
+        <w:t xml:space="preserve">1234</w:t>
+      </w:r>
+      <w:r>
+        <w:rPr>
+          <w:rStyle w:val="NormalTok"/>
+        </w:rPr>
+        <w:t xml:space="preserve">,</w:t>
+      </w:r>
+      <w:r>
+        <w:br/>
+      </w:r>
+      <w:r>
+        <w:rPr>
+          <w:rStyle w:val="NormalTok"/>
+        </w:rPr>
+        <w:t xml:space="preserve">                        </w:t>
+      </w:r>
+      <w:r>
+        <w:rPr>
+          <w:rStyle w:val="AttributeTok"/>
+        </w:rPr>
+        <w:t xml:space="preserve">argument4 =</w:t>
+      </w:r>
+      <w:r>
+        <w:rPr>
+          <w:rStyle w:val="NormalTok"/>
+        </w:rPr>
+        <w:t xml:space="preserve"> </w:t>
+      </w:r>
+      <w:r>
+        <w:rPr>
+          <w:rStyle w:val="FunctionTok"/>
+        </w:rPr>
+        <w:t xml:space="preserve">c</w:t>
+      </w:r>
+      <w:r>
+        <w:rPr>
+          <w:rStyle w:val="NormalTok"/>
+        </w:rPr>
+        <w:t xml:space="preserve">(</w:t>
+      </w:r>
+      <w:r>
+        <w:rPr>
+          <w:rStyle w:val="ConstantTok"/>
+        </w:rPr>
+        <w:t xml:space="preserve">TRUE</w:t>
+      </w:r>
+      <w:r>
+        <w:rPr>
+          <w:rStyle w:val="NormalTok"/>
+        </w:rPr>
+        <w:t xml:space="preserve">, </w:t>
+      </w:r>
+      <w:r>
+        <w:rPr>
+          <w:rStyle w:val="ConstantTok"/>
+        </w:rPr>
+        <w:t xml:space="preserve">FALSE</w:t>
+      </w:r>
+      <w:r>
+        <w:rPr>
+          <w:rStyle w:val="NormalTok"/>
+        </w:rPr>
+        <w:t xml:space="preserve">),</w:t>
+      </w:r>
+      <w:r>
+        <w:br/>
+      </w:r>
+      <w:r>
+        <w:rPr>
+          <w:rStyle w:val="NormalTok"/>
+        </w:rPr>
+        <w:t xml:space="preserve">                        </w:t>
+      </w:r>
+      <w:r>
+        <w:rPr>
+          <w:rStyle w:val="AttributeTok"/>
+        </w:rPr>
+        <w:t xml:space="preserve">argument5 =</w:t>
+      </w:r>
+      <w:r>
+        <w:rPr>
+          <w:rStyle w:val="NormalTok"/>
+        </w:rPr>
+        <w:t xml:space="preserve"> my_data)</w:t>
+      </w:r>
+    </w:p>
     <w:bookmarkEnd w:id="28"/>
+    <w:bookmarkEnd w:id="29"/>
     <w:sectPr/>
   </w:body>
 </w:document>
@@ -461,8 +790,202 @@
       </w:pPr>
     </w:lvl>
   </w:abstractNum>
+  <w:abstractNum w:abstractNumId="991">
+    <w:nsid w:val="A991"/>
+    <w:multiLevelType w:val="multilevel"/>
+    <w:lvl w:ilvl="0">
+      <w:numFmt w:val="bullet"/>
+      <w:lvlText w:val="•"/>
+      <w:lvlJc w:val="left"/>
+      <w:pPr>
+        <w:ind w:left="720" w:hanging="480"/>
+      </w:pPr>
+    </w:lvl>
+    <w:lvl w:ilvl="1">
+      <w:numFmt w:val="bullet"/>
+      <w:lvlText w:val="–"/>
+      <w:lvlJc w:val="left"/>
+      <w:pPr>
+        <w:ind w:left="1440" w:hanging="480"/>
+      </w:pPr>
+    </w:lvl>
+    <w:lvl w:ilvl="2">
+      <w:numFmt w:val="bullet"/>
+      <w:lvlText w:val="•"/>
+      <w:lvlJc w:val="left"/>
+      <w:pPr>
+        <w:ind w:left="2160" w:hanging="480"/>
+      </w:pPr>
+    </w:lvl>
+    <w:lvl w:ilvl="3">
+      <w:numFmt w:val="bullet"/>
+      <w:lvlText w:val="–"/>
+      <w:lvlJc w:val="left"/>
+      <w:pPr>
+        <w:ind w:left="2880" w:hanging="480"/>
+      </w:pPr>
+    </w:lvl>
+    <w:lvl w:ilvl="4">
+      <w:numFmt w:val="bullet"/>
+      <w:lvlText w:val="•"/>
+      <w:lvlJc w:val="left"/>
+      <w:pPr>
+        <w:ind w:left="3600" w:hanging="480"/>
+      </w:pPr>
+    </w:lvl>
+    <w:lvl w:ilvl="5">
+      <w:numFmt w:val="bullet"/>
+      <w:lvlText w:val="–"/>
+      <w:lvlJc w:val="left"/>
+      <w:pPr>
+        <w:ind w:left="4320" w:hanging="480"/>
+      </w:pPr>
+    </w:lvl>
+    <w:lvl w:ilvl="6">
+      <w:numFmt w:val="bullet"/>
+      <w:lvlText w:val="•"/>
+      <w:lvlJc w:val="left"/>
+      <w:pPr>
+        <w:ind w:left="5040" w:hanging="480"/>
+      </w:pPr>
+    </w:lvl>
+    <w:lvl w:ilvl="7">
+      <w:numFmt w:val="bullet"/>
+      <w:lvlText w:val="–"/>
+      <w:lvlJc w:val="left"/>
+      <w:pPr>
+        <w:ind w:left="5760" w:hanging="480"/>
+      </w:pPr>
+    </w:lvl>
+    <w:lvl w:ilvl="8">
+      <w:numFmt w:val="bullet"/>
+      <w:lvlText w:val="•"/>
+      <w:lvlJc w:val="left"/>
+      <w:pPr>
+        <w:ind w:left="6480" w:hanging="480"/>
+      </w:pPr>
+    </w:lvl>
+  </w:abstractNum>
+  <w:abstractNum w:abstractNumId="99411">
+    <w:nsid w:val="A99411"/>
+    <w:multiLevelType w:val="multilevel"/>
+    <w:lvl w:ilvl="0">
+      <w:start w:val="1"/>
+      <w:numFmt w:val="decimal"/>
+      <w:lvlText w:val="%1."/>
+      <w:lvlJc w:val="left"/>
+      <w:pPr>
+        <w:ind w:left="720" w:hanging="480"/>
+      </w:pPr>
+    </w:lvl>
+    <w:lvl w:ilvl="1">
+      <w:start w:val="1"/>
+      <w:numFmt w:val="decimal"/>
+      <w:lvlText w:val="%2."/>
+      <w:lvlJc w:val="left"/>
+      <w:pPr>
+        <w:ind w:left="1440" w:hanging="480"/>
+      </w:pPr>
+    </w:lvl>
+    <w:lvl w:ilvl="2">
+      <w:start w:val="1"/>
+      <w:numFmt w:val="decimal"/>
+      <w:lvlText w:val="%3."/>
+      <w:lvlJc w:val="left"/>
+      <w:pPr>
+        <w:ind w:left="2160" w:hanging="480"/>
+      </w:pPr>
+    </w:lvl>
+    <w:lvl w:ilvl="3">
+      <w:start w:val="1"/>
+      <w:numFmt w:val="decimal"/>
+      <w:lvlText w:val="%4."/>
+      <w:lvlJc w:val="left"/>
+      <w:pPr>
+        <w:ind w:left="2880" w:hanging="480"/>
+      </w:pPr>
+    </w:lvl>
+    <w:lvl w:ilvl="4">
+      <w:start w:val="1"/>
+      <w:numFmt w:val="decimal"/>
+      <w:lvlText w:val="%5."/>
+      <w:lvlJc w:val="left"/>
+      <w:pPr>
+        <w:ind w:left="3600" w:hanging="480"/>
+      </w:pPr>
+    </w:lvl>
+    <w:lvl w:ilvl="5">
+      <w:start w:val="1"/>
+      <w:numFmt w:val="decimal"/>
+      <w:lvlText w:val="%6."/>
+      <w:lvlJc w:val="left"/>
+      <w:pPr>
+        <w:ind w:left="4320" w:hanging="480"/>
+      </w:pPr>
+    </w:lvl>
+    <w:lvl w:ilvl="6">
+      <w:start w:val="1"/>
+      <w:numFmt w:val="decimal"/>
+      <w:lvlText w:val="%7."/>
+      <w:lvlJc w:val="left"/>
+      <w:pPr>
+        <w:ind w:left="5040" w:hanging="480"/>
+      </w:pPr>
+    </w:lvl>
+    <w:lvl w:ilvl="7">
+      <w:start w:val="1"/>
+      <w:numFmt w:val="decimal"/>
+      <w:lvlText w:val="%8."/>
+      <w:lvlJc w:val="left"/>
+      <w:pPr>
+        <w:ind w:left="5760" w:hanging="480"/>
+      </w:pPr>
+    </w:lvl>
+    <w:lvl w:ilvl="8">
+      <w:start w:val="1"/>
+      <w:numFmt w:val="decimal"/>
+      <w:lvlText w:val="%9."/>
+      <w:lvlJc w:val="left"/>
+      <w:pPr>
+        <w:ind w:left="6480" w:hanging="480"/>
+      </w:pPr>
+    </w:lvl>
+  </w:abstractNum>
   <w:num w:numId="1000">
     <w:abstractNumId w:val="990"/>
+  </w:num>
+  <w:num w:numId="1001">
+    <w:abstractNumId w:val="991"/>
+  </w:num>
+  <w:num w:numId="1002">
+    <w:abstractNumId w:val="99411"/>
+    <w:lvlOverride w:ilvl="0">
+      <w:startOverride w:val="1"/>
+    </w:lvlOverride>
+    <w:lvlOverride w:ilvl="1">
+      <w:startOverride w:val="1"/>
+    </w:lvlOverride>
+    <w:lvlOverride w:ilvl="2">
+      <w:startOverride w:val="1"/>
+    </w:lvlOverride>
+    <w:lvlOverride w:ilvl="3">
+      <w:startOverride w:val="1"/>
+    </w:lvlOverride>
+    <w:lvlOverride w:ilvl="4">
+      <w:startOverride w:val="1"/>
+    </w:lvlOverride>
+    <w:lvlOverride w:ilvl="5">
+      <w:startOverride w:val="1"/>
+    </w:lvlOverride>
+    <w:lvlOverride w:ilvl="6">
+      <w:startOverride w:val="1"/>
+    </w:lvlOverride>
+    <w:lvlOverride w:ilvl="7">
+      <w:startOverride w:val="1"/>
+    </w:lvlOverride>
+    <w:lvlOverride w:ilvl="8">
+      <w:startOverride w:val="1"/>
+    </w:lvlOverride>
   </w:num>
 </w:numbering>
 </file>

</xml_diff>